<commit_message>
Fix DEFENSE_QA_FA.docx formulas rendering as raw text/wrong font
Pandoc's math parser does not support the TeX \rm font-switch command inside
$...$; the 5 formulas using it (r_{\rm mid}, K_{\rm eff} x3, N_{\rm dof})
fell back to literal LaTeX source text in a mismatched font instead of a
proper Word equation. Dropped \rm, matching the plain-subscript convention
used everywhere else in the thesis math -- all 5 now convert cleanly with
zero pandoc warnings.

Co-Authored-By: Claude Sonnet 5 <noreply@anthropic.com>
</commit_message>
<xml_diff>
--- a/claude/governance/DEFENSE_QA_FA.docx
+++ b/claude/governance/DEFENSE_QA_FA.docx
@@ -2500,12 +2500,65 @@
         </w:rPr>
         <w:t xml:space="preserve"> </w:t>
       </w:r>
-      <w:r>
-        <w:rPr>
-          <w:rtl/>
-        </w:rPr>
-        <w:t xml:space="preserve">$\zeta=(r-r_{\rm mid})/h$</w:t>
-      </w:r>
+      <m:oMath>
+        <m:r>
+          <m:t>ζ</m:t>
+        </m:r>
+        <m:r>
+          <m:rPr>
+            <m:sty m:val="p"/>
+          </m:rPr>
+          <m:t>=</m:t>
+        </m:r>
+        <m:r>
+          <m:rPr>
+            <m:sty m:val="p"/>
+          </m:rPr>
+          <m:t>(</m:t>
+        </m:r>
+        <m:r>
+          <m:t>r</m:t>
+        </m:r>
+        <m:r>
+          <m:rPr>
+            <m:sty m:val="p"/>
+          </m:rPr>
+          <m:t>−</m:t>
+        </m:r>
+        <m:sSub>
+          <m:e>
+            <m:r>
+              <m:t>r</m:t>
+            </m:r>
+          </m:e>
+          <m:sub>
+            <m:r>
+              <m:t>m</m:t>
+            </m:r>
+            <m:r>
+              <m:t>i</m:t>
+            </m:r>
+            <m:r>
+              <m:t>d</m:t>
+            </m:r>
+          </m:sub>
+        </m:sSub>
+        <m:r>
+          <m:rPr>
+            <m:sty m:val="p"/>
+          </m:rPr>
+          <m:t>)</m:t>
+        </m:r>
+        <m:r>
+          <m:rPr>
+            <m:sty m:val="p"/>
+          </m:rPr>
+          <m:t>/</m:t>
+        </m:r>
+        <m:r>
+          <m:t>h</m:t>
+        </m:r>
+      </m:oMath>
       <w:r>
         <w:rPr>
           <w:rtl/>
@@ -4501,14 +4554,26 @@
         </w:rPr>
         <w:t xml:space="preserve"> </w:t>
       </w:r>
-      <w:r>
-        <w:rPr>
-          <w:b/>
-          <w:bCs/>
-          <w:rtl/>
-        </w:rPr>
-        <w:t xml:space="preserve">$K_{\rm eff}$</w:t>
-      </w:r>
+      <m:oMath>
+        <m:sSub>
+          <m:e>
+            <m:r>
+              <m:t>K</m:t>
+            </m:r>
+          </m:e>
+          <m:sub>
+            <m:r>
+              <m:t>e</m:t>
+            </m:r>
+            <m:r>
+              <m:t>f</m:t>
+            </m:r>
+            <m:r>
+              <m:t>f</m:t>
+            </m:r>
+          </m:sub>
+        </m:sSub>
+      </m:oMath>
       <w:r>
         <w:rPr>
           <w:b/>
@@ -4558,12 +4623,80 @@
         </w:rPr>
         <w:t xml:space="preserve"> </w:t>
       </w:r>
-      <w:r>
-        <w:rPr>
-          <w:rtl/>
-        </w:rPr>
-        <w:t xml:space="preserve">$N_{\rm dof}=3\,N_L\,N_r\,N_z$</w:t>
-      </w:r>
+      <m:oMath>
+        <m:sSub>
+          <m:e>
+            <m:r>
+              <m:t>N</m:t>
+            </m:r>
+          </m:e>
+          <m:sub>
+            <m:r>
+              <m:t>d</m:t>
+            </m:r>
+            <m:r>
+              <m:t>o</m:t>
+            </m:r>
+            <m:r>
+              <m:t>f</m:t>
+            </m:r>
+          </m:sub>
+        </m:sSub>
+        <m:r>
+          <m:rPr>
+            <m:sty m:val="p"/>
+          </m:rPr>
+          <m:t>=</m:t>
+        </m:r>
+        <m:r>
+          <m:t>3</m:t>
+        </m:r>
+        <m:r>
+          <m:t> </m:t>
+        </m:r>
+        <m:sSub>
+          <m:e>
+            <m:r>
+              <m:t>N</m:t>
+            </m:r>
+          </m:e>
+          <m:sub>
+            <m:r>
+              <m:t>L</m:t>
+            </m:r>
+          </m:sub>
+        </m:sSub>
+        <m:r>
+          <m:t> </m:t>
+        </m:r>
+        <m:sSub>
+          <m:e>
+            <m:r>
+              <m:t>N</m:t>
+            </m:r>
+          </m:e>
+          <m:sub>
+            <m:r>
+              <m:t>r</m:t>
+            </m:r>
+          </m:sub>
+        </m:sSub>
+        <m:r>
+          <m:t> </m:t>
+        </m:r>
+        <m:sSub>
+          <m:e>
+            <m:r>
+              <m:t>N</m:t>
+            </m:r>
+          </m:e>
+          <m:sub>
+            <m:r>
+              <m:t>z</m:t>
+            </m:r>
+          </m:sub>
+        </m:sSub>
+      </m:oMath>
       <w:r>
         <w:rPr>
           <w:rtl/>
@@ -4620,12 +4753,77 @@
         </w:rPr>
         <w:t xml:space="preserve"> </w:t>
       </w:r>
-      <w:r>
-        <w:rPr>
-          <w:rtl/>
-        </w:rPr>
-        <w:t xml:space="preserve">$K_{\rm eff}=K+a_0 M+a_1 C$</w:t>
-      </w:r>
+      <m:oMath>
+        <m:sSub>
+          <m:e>
+            <m:r>
+              <m:t>K</m:t>
+            </m:r>
+          </m:e>
+          <m:sub>
+            <m:r>
+              <m:t>e</m:t>
+            </m:r>
+            <m:r>
+              <m:t>f</m:t>
+            </m:r>
+            <m:r>
+              <m:t>f</m:t>
+            </m:r>
+          </m:sub>
+        </m:sSub>
+        <m:r>
+          <m:rPr>
+            <m:sty m:val="p"/>
+          </m:rPr>
+          <m:t>=</m:t>
+        </m:r>
+        <m:r>
+          <m:t>K</m:t>
+        </m:r>
+        <m:r>
+          <m:rPr>
+            <m:sty m:val="p"/>
+          </m:rPr>
+          <m:t>+</m:t>
+        </m:r>
+        <m:sSub>
+          <m:e>
+            <m:r>
+              <m:t>a</m:t>
+            </m:r>
+          </m:e>
+          <m:sub>
+            <m:r>
+              <m:t>0</m:t>
+            </m:r>
+          </m:sub>
+        </m:sSub>
+        <m:r>
+          <m:t>M</m:t>
+        </m:r>
+        <m:r>
+          <m:rPr>
+            <m:sty m:val="p"/>
+          </m:rPr>
+          <m:t>+</m:t>
+        </m:r>
+        <m:sSub>
+          <m:e>
+            <m:r>
+              <m:t>a</m:t>
+            </m:r>
+          </m:e>
+          <m:sub>
+            <m:r>
+              <m:t>1</m:t>
+            </m:r>
+          </m:sub>
+        </m:sSub>
+        <m:r>
+          <m:t>C</m:t>
+        </m:r>
+      </m:oMath>
       <w:r>
         <w:rPr>
           <w:rtl/>
@@ -4815,12 +5013,26 @@
         </w:rPr>
         <w:t xml:space="preserve"> </w:t>
       </w:r>
-      <w:r>
-        <w:rPr>
-          <w:rtl/>
-        </w:rPr>
-        <w:t xml:space="preserve">$K_{\rm eff}$</w:t>
-      </w:r>
+      <m:oMath>
+        <m:sSub>
+          <m:e>
+            <m:r>
+              <m:t>K</m:t>
+            </m:r>
+          </m:e>
+          <m:sub>
+            <m:r>
+              <m:t>e</m:t>
+            </m:r>
+            <m:r>
+              <m:t>f</m:t>
+            </m:r>
+            <m:r>
+              <m:t>f</m:t>
+            </m:r>
+          </m:sub>
+        </m:sSub>
+      </m:oMath>
       <w:r>
         <w:rPr>
           <w:rtl/>

</xml_diff>